<commit_message>
polished visualizations. Added logit vs log2 transforming prior to limma. Added writer for dataset with limma stats included.
</commit_message>
<xml_diff>
--- a/jupyter_notebooks/Proteomics/psmsToOccupancies_overview.docx
+++ b/jupyter_notebooks/Proteomics/psmsToOccupancies_overview.docx
@@ -27,7 +27,7 @@
           <w:iCs/>
           <w:color w:val="555555"/>
         </w:rPr>
-        <w:t xml:space="preserve">Converts MetaMorpheus PSM-level TMT intensities into per-site post-translational modification (PTM) occupancies across 18 channels (9 undrugged / 9 drugged) for an islet drug-treatment study.</w:t>
+        <w:t xml:space="preserve">Converts MetaMorpheus PSM-level TMT intensities into per-site post-translational modification (PTM) occupancies across 18 channels (9 undrugged / 9 drugged) for an islet drug-treatment study, then runs a paired differential analysis to identify sites whose occupancy changes between conditions.</w:t>
       </w:r>
     </w:p>
     <w:p>
@@ -46,7 +46,7 @@
     </w:p>
     <w:tbl>
       <w:tblPr>
-        <w:tblW w:type="dxa" w:w="9360"/>
+        <w:tblW w:type="dxa" w:w="9280"/>
         <w:tblBorders>
           <w:top w:val="single" w:color="auto" w:sz="4"/>
           <w:left w:val="single" w:color="auto" w:sz="4"/>
@@ -57,22 +57,24 @@
         </w:tblBorders>
       </w:tblPr>
       <w:tblGrid>
-        <w:gridCol w:w="1500"/>
-        <w:gridCol w:w="260"/>
-        <w:gridCol w:w="1500"/>
-        <w:gridCol w:w="260"/>
-        <w:gridCol w:w="1500"/>
-        <w:gridCol w:w="260"/>
-        <w:gridCol w:w="1500"/>
-        <w:gridCol w:w="260"/>
-        <w:gridCol w:w="1500"/>
-        <w:gridCol w:w="260"/>
-        <w:gridCol w:w="1500"/>
+        <w:gridCol w:w="1280"/>
+        <w:gridCol w:w="220"/>
+        <w:gridCol w:w="1280"/>
+        <w:gridCol w:w="220"/>
+        <w:gridCol w:w="1280"/>
+        <w:gridCol w:w="220"/>
+        <w:gridCol w:w="1280"/>
+        <w:gridCol w:w="220"/>
+        <w:gridCol w:w="1280"/>
+        <w:gridCol w:w="220"/>
+        <w:gridCol w:w="1280"/>
+        <w:gridCol w:w="220"/>
+        <w:gridCol w:w="1280"/>
       </w:tblGrid>
       <w:tr>
         <w:tc>
           <w:tcPr>
-            <w:tcW w:type="dxa" w:w="1500"/>
+            <w:tcW w:type="dxa" w:w="1280"/>
             <w:tcBorders>
               <w:top w:val="single" w:color="888888" w:sz="4"/>
               <w:left w:val="single" w:color="888888" w:sz="4"/>
@@ -82,9 +84,9 @@
             <w:shd w:fill="E6EFFA" w:val="clear"/>
             <w:tcMar>
               <w:top w:type="dxa" w:w="100"/>
-              <w:left w:type="dxa" w:w="100"/>
+              <w:left w:type="dxa" w:w="80"/>
               <w:bottom w:type="dxa" w:w="100"/>
-              <w:right w:type="dxa" w:w="100"/>
+              <w:right w:type="dxa" w:w="80"/>
             </w:tcMar>
           </w:tcPr>
           <w:p>
@@ -94,8 +96,8 @@
             </w:pPr>
             <w:r>
               <w:rPr>
-                <w:sz w:val="18"/>
-                <w:szCs w:val="18"/>
+                <w:sz w:val="16"/>
+                <w:szCs w:val="16"/>
               </w:rPr>
               <w:t xml:space="preserve">AllPSMs.psmtsv</w:t>
             </w:r>
@@ -107,8 +109,8 @@
             </w:pPr>
             <w:r>
               <w:rPr>
-                <w:sz w:val="18"/>
-                <w:szCs w:val="18"/>
+                <w:sz w:val="16"/>
+                <w:szCs w:val="16"/>
               </w:rPr>
               <w:t xml:space="preserve">(430,665 PSMs)</w:t>
             </w:r>
@@ -116,7 +118,7 @@
         </w:tc>
         <w:tc>
           <w:tcPr>
-            <w:tcW w:type="dxa" w:w="260"/>
+            <w:tcW w:type="dxa" w:w="220"/>
             <w:tcBorders>
               <w:top w:val="none" w:color="FFFFFF" w:sz="0"/>
               <w:left w:val="none" w:color="FFFFFF" w:sz="0"/>
@@ -147,7 +149,7 @@
         </w:tc>
         <w:tc>
           <w:tcPr>
-            <w:tcW w:type="dxa" w:w="1500"/>
+            <w:tcW w:type="dxa" w:w="1280"/>
             <w:tcBorders>
               <w:top w:val="single" w:color="888888" w:sz="4"/>
               <w:left w:val="single" w:color="888888" w:sz="4"/>
@@ -157,9 +159,9 @@
             <w:shd w:fill="FEF5E7" w:val="clear"/>
             <w:tcMar>
               <w:top w:type="dxa" w:w="100"/>
-              <w:left w:type="dxa" w:w="100"/>
+              <w:left w:type="dxa" w:w="80"/>
               <w:bottom w:type="dxa" w:w="100"/>
-              <w:right w:type="dxa" w:w="100"/>
+              <w:right w:type="dxa" w:w="80"/>
             </w:tcMar>
           </w:tcPr>
           <w:p>
@@ -169,8 +171,8 @@
             </w:pPr>
             <w:r>
               <w:rPr>
-                <w:sz w:val="18"/>
-                <w:szCs w:val="18"/>
+                <w:sz w:val="16"/>
+                <w:szCs w:val="16"/>
               </w:rPr>
               <w:t xml:space="preserve">Filter &amp; QC</w:t>
             </w:r>
@@ -182,10 +184,10 @@
             </w:pPr>
             <w:r>
               <w:rPr>
-                <w:sz w:val="18"/>
-                <w:szCs w:val="18"/>
+                <w:sz w:val="16"/>
+                <w:szCs w:val="16"/>
               </w:rPr>
-              <w:t xml:space="preserve">(q&lt;0.01, targets,</w:t>
+              <w:t xml:space="preserve">(q&lt;0.01, ambig=1,</w:t>
             </w:r>
           </w:p>
           <w:p>
@@ -195,8 +197,8 @@
             </w:pPr>
             <w:r>
               <w:rPr>
-                <w:sz w:val="18"/>
-                <w:szCs w:val="18"/>
+                <w:sz w:val="16"/>
+                <w:szCs w:val="16"/>
               </w:rPr>
               <w:t xml:space="preserve">no zero channels)</w:t>
             </w:r>
@@ -204,7 +206,7 @@
         </w:tc>
         <w:tc>
           <w:tcPr>
-            <w:tcW w:type="dxa" w:w="260"/>
+            <w:tcW w:type="dxa" w:w="220"/>
             <w:tcBorders>
               <w:top w:val="none" w:color="FFFFFF" w:sz="0"/>
               <w:left w:val="none" w:color="FFFFFF" w:sz="0"/>
@@ -235,7 +237,7 @@
         </w:tc>
         <w:tc>
           <w:tcPr>
-            <w:tcW w:type="dxa" w:w="1500"/>
+            <w:tcW w:type="dxa" w:w="1280"/>
             <w:tcBorders>
               <w:top w:val="single" w:color="888888" w:sz="4"/>
               <w:left w:val="single" w:color="888888" w:sz="4"/>
@@ -245,9 +247,9 @@
             <w:shd w:fill="FEF5E7" w:val="clear"/>
             <w:tcMar>
               <w:top w:type="dxa" w:w="100"/>
-              <w:left w:type="dxa" w:w="100"/>
+              <w:left w:type="dxa" w:w="80"/>
               <w:bottom w:type="dxa" w:w="100"/>
-              <w:right w:type="dxa" w:w="100"/>
+              <w:right w:type="dxa" w:w="80"/>
             </w:tcMar>
           </w:tcPr>
           <w:p>
@@ -257,8 +259,8 @@
             </w:pPr>
             <w:r>
               <w:rPr>
-                <w:sz w:val="18"/>
-                <w:szCs w:val="18"/>
+                <w:sz w:val="16"/>
+                <w:szCs w:val="16"/>
               </w:rPr>
               <w:t xml:space="preserve">Median-normalize</w:t>
             </w:r>
@@ -270,8 +272,8 @@
             </w:pPr>
             <w:r>
               <w:rPr>
-                <w:sz w:val="18"/>
-                <w:szCs w:val="18"/>
+                <w:sz w:val="16"/>
+                <w:szCs w:val="16"/>
               </w:rPr>
               <w:t xml:space="preserve">18 TMT channels</w:t>
             </w:r>
@@ -279,7 +281,7 @@
         </w:tc>
         <w:tc>
           <w:tcPr>
-            <w:tcW w:type="dxa" w:w="260"/>
+            <w:tcW w:type="dxa" w:w="220"/>
             <w:tcBorders>
               <w:top w:val="none" w:color="FFFFFF" w:sz="0"/>
               <w:left w:val="none" w:color="FFFFFF" w:sz="0"/>
@@ -310,7 +312,7 @@
         </w:tc>
         <w:tc>
           <w:tcPr>
-            <w:tcW w:type="dxa" w:w="1500"/>
+            <w:tcW w:type="dxa" w:w="1280"/>
             <w:tcBorders>
               <w:top w:val="single" w:color="888888" w:sz="4"/>
               <w:left w:val="single" w:color="888888" w:sz="4"/>
@@ -320,9 +322,9 @@
             <w:shd w:fill="E8F5E9" w:val="clear"/>
             <w:tcMar>
               <w:top w:type="dxa" w:w="100"/>
-              <w:left w:type="dxa" w:w="100"/>
+              <w:left w:type="dxa" w:w="80"/>
               <w:bottom w:type="dxa" w:w="100"/>
-              <w:right w:type="dxa" w:w="100"/>
+              <w:right w:type="dxa" w:w="80"/>
             </w:tcMar>
           </w:tcPr>
           <w:p>
@@ -332,8 +334,8 @@
             </w:pPr>
             <w:r>
               <w:rPr>
-                <w:sz w:val="18"/>
-                <w:szCs w:val="18"/>
+                <w:sz w:val="16"/>
+                <w:szCs w:val="16"/>
               </w:rPr>
               <w:t xml:space="preserve">Map peptide mods</w:t>
             </w:r>
@@ -345,16 +347,29 @@
             </w:pPr>
             <w:r>
               <w:rPr>
-                <w:sz w:val="18"/>
-                <w:szCs w:val="18"/>
+                <w:sz w:val="16"/>
+                <w:szCs w:val="16"/>
               </w:rPr>
               <w:t xml:space="preserve">to protein sites</w:t>
+            </w:r>
+          </w:p>
+          <w:p>
+            <w:pPr>
+              <w:spacing w:after="0" w:line="240"/>
+              <w:jc w:val="center"/>
+            </w:pPr>
+            <w:r>
+              <w:rPr>
+                <w:sz w:val="16"/>
+                <w:szCs w:val="16"/>
+              </w:rPr>
+              <w:t xml:space="preserve">(660 sites)</w:t>
             </w:r>
           </w:p>
         </w:tc>
         <w:tc>
           <w:tcPr>
-            <w:tcW w:type="dxa" w:w="260"/>
+            <w:tcW w:type="dxa" w:w="220"/>
             <w:tcBorders>
               <w:top w:val="none" w:color="FFFFFF" w:sz="0"/>
               <w:left w:val="none" w:color="FFFFFF" w:sz="0"/>
@@ -385,7 +400,7 @@
         </w:tc>
         <w:tc>
           <w:tcPr>
-            <w:tcW w:type="dxa" w:w="1500"/>
+            <w:tcW w:type="dxa" w:w="1280"/>
             <w:tcBorders>
               <w:top w:val="single" w:color="888888" w:sz="4"/>
               <w:left w:val="single" w:color="888888" w:sz="4"/>
@@ -395,9 +410,9 @@
             <w:shd w:fill="E8F5E9" w:val="clear"/>
             <w:tcMar>
               <w:top w:type="dxa" w:w="100"/>
-              <w:left w:type="dxa" w:w="100"/>
+              <w:left w:type="dxa" w:w="80"/>
               <w:bottom w:type="dxa" w:w="100"/>
-              <w:right w:type="dxa" w:w="100"/>
+              <w:right w:type="dxa" w:w="80"/>
             </w:tcMar>
           </w:tcPr>
           <w:p>
@@ -407,8 +422,8 @@
             </w:pPr>
             <w:r>
               <w:rPr>
-                <w:sz w:val="18"/>
-                <w:szCs w:val="18"/>
+                <w:sz w:val="16"/>
+                <w:szCs w:val="16"/>
               </w:rPr>
               <w:t xml:space="preserve">Compute occupancy</w:t>
             </w:r>
@@ -420,16 +435,16 @@
             </w:pPr>
             <w:r>
               <w:rPr>
-                <w:sz w:val="18"/>
-                <w:szCs w:val="18"/>
+                <w:sz w:val="16"/>
+                <w:szCs w:val="16"/>
               </w:rPr>
-              <w:t xml:space="preserve">= mod / total</w:t>
+              <w:t xml:space="preserve">+ derived metrics</w:t>
             </w:r>
           </w:p>
         </w:tc>
         <w:tc>
           <w:tcPr>
-            <w:tcW w:type="dxa" w:w="260"/>
+            <w:tcW w:type="dxa" w:w="220"/>
             <w:tcBorders>
               <w:top w:val="none" w:color="FFFFFF" w:sz="0"/>
               <w:left w:val="none" w:color="FFFFFF" w:sz="0"/>
@@ -460,7 +475,7 @@
         </w:tc>
         <w:tc>
           <w:tcPr>
-            <w:tcW w:type="dxa" w:w="1500"/>
+            <w:tcW w:type="dxa" w:w="1280"/>
             <w:tcBorders>
               <w:top w:val="single" w:color="888888" w:sz="4"/>
               <w:left w:val="single" w:color="888888" w:sz="4"/>
@@ -470,9 +485,9 @@
             <w:shd w:fill="FCE4EC" w:val="clear"/>
             <w:tcMar>
               <w:top w:type="dxa" w:w="100"/>
-              <w:left w:type="dxa" w:w="100"/>
+              <w:left w:type="dxa" w:w="80"/>
               <w:bottom w:type="dxa" w:w="100"/>
-              <w:right w:type="dxa" w:w="100"/>
+              <w:right w:type="dxa" w:w="80"/>
             </w:tcMar>
           </w:tcPr>
           <w:p>
@@ -482,8 +497,8 @@
             </w:pPr>
             <w:r>
               <w:rPr>
-                <w:sz w:val="18"/>
-                <w:szCs w:val="18"/>
+                <w:sz w:val="16"/>
+                <w:szCs w:val="16"/>
               </w:rPr>
               <w:t xml:space="preserve">Filter &amp; write</w:t>
             </w:r>
@@ -495,10 +510,85 @@
             </w:pPr>
             <w:r>
               <w:rPr>
-                <w:sz w:val="18"/>
-                <w:szCs w:val="18"/>
+                <w:sz w:val="16"/>
+                <w:szCs w:val="16"/>
               </w:rPr>
-              <w:t xml:space="preserve">TSV (515 sites)</w:t>
+              <w:t xml:space="preserve">TSV (379 sites)</w:t>
+            </w:r>
+          </w:p>
+        </w:tc>
+        <w:tc>
+          <w:tcPr>
+            <w:tcW w:type="dxa" w:w="220"/>
+            <w:tcBorders>
+              <w:top w:val="none" w:color="FFFFFF" w:sz="0"/>
+              <w:left w:val="none" w:color="FFFFFF" w:sz="0"/>
+              <w:bottom w:val="none" w:color="FFFFFF" w:sz="0"/>
+              <w:right w:val="none" w:color="FFFFFF" w:sz="0"/>
+            </w:tcBorders>
+            <w:tcMar>
+              <w:top w:type="dxa" w:w="100"/>
+              <w:left w:type="dxa" w:w="0"/>
+              <w:bottom w:type="dxa" w:w="100"/>
+              <w:right w:type="dxa" w:w="0"/>
+            </w:tcMar>
+          </w:tcPr>
+          <w:p>
+            <w:pPr>
+              <w:jc w:val="center"/>
+            </w:pPr>
+            <w:r>
+              <w:rPr>
+                <w:b/>
+                <w:bCs/>
+                <w:sz w:val="28"/>
+                <w:szCs w:val="28"/>
+              </w:rPr>
+              <w:t xml:space="preserve">→</w:t>
+            </w:r>
+          </w:p>
+        </w:tc>
+        <w:tc>
+          <w:tcPr>
+            <w:tcW w:type="dxa" w:w="1280"/>
+            <w:tcBorders>
+              <w:top w:val="single" w:color="888888" w:sz="4"/>
+              <w:left w:val="single" w:color="888888" w:sz="4"/>
+              <w:bottom w:val="single" w:color="888888" w:sz="4"/>
+              <w:right w:val="single" w:color="888888" w:sz="4"/>
+            </w:tcBorders>
+            <w:shd w:fill="F3E5F5" w:val="clear"/>
+            <w:tcMar>
+              <w:top w:type="dxa" w:w="100"/>
+              <w:left w:type="dxa" w:w="80"/>
+              <w:bottom w:type="dxa" w:w="100"/>
+              <w:right w:type="dxa" w:w="80"/>
+            </w:tcMar>
+          </w:tcPr>
+          <w:p>
+            <w:pPr>
+              <w:spacing w:after="0" w:line="240"/>
+              <w:jc w:val="center"/>
+            </w:pPr>
+            <w:r>
+              <w:rPr>
+                <w:sz w:val="16"/>
+                <w:szCs w:val="16"/>
+              </w:rPr>
+              <w:t xml:space="preserve">limma-py paired</w:t>
+            </w:r>
+          </w:p>
+          <w:p>
+            <w:pPr>
+              <w:spacing w:after="0" w:line="240"/>
+              <w:jc w:val="center"/>
+            </w:pPr>
+            <w:r>
+              <w:rPr>
+                <w:sz w:val="16"/>
+                <w:szCs w:val="16"/>
+              </w:rPr>
+              <w:t xml:space="preserve">analysis &amp; volcano</w:t>
             </w:r>
           </w:p>
         </w:tc>
@@ -701,7 +791,46 @@
         <w:t xml:space="preserve">undrugged, drugged, undrugged, drugged, …</w:t>
       </w:r>
       <w:r>
-        <w:t xml:space="preserve"> starting at channel 126 — 9 undrugged and 9 drugged samples in total.</w:t>
+        <w:t xml:space="preserve"> starting at channel 126 — 9 paired mice (one undrugged + one drugged channel per mouse).</w:t>
+      </w:r>
+    </w:p>
+    <w:p>
+      <w:pPr>
+        <w:pStyle w:val="ListParagraph"/>
+        <w:numPr>
+          <w:ilvl w:val="0"/>
+          <w:numId w:val="2"/>
+        </w:numPr>
+        <w:spacing w:after="80" w:line="280"/>
+      </w:pPr>
+      <w:r>
+        <w:rPr>
+          <w:b/>
+          <w:bCs/>
+        </w:rPr>
+        <w:t xml:space="preserve">External libraries: </w:t>
+      </w:r>
+      <w:r>
+        <w:rPr>
+          <w:rFonts w:ascii="Consolas" w:cs="Consolas" w:eastAsia="Consolas" w:hAnsi="Consolas"/>
+          <w:sz w:val="22"/>
+          <w:szCs w:val="22"/>
+        </w:rPr>
+        <w:t xml:space="preserve">limma_py</w:t>
+      </w:r>
+      <w:r>
+        <w:t xml:space="preserve"> (eBayes-moderated linear modelling for differential analysis), </w:t>
+      </w:r>
+      <w:r>
+        <w:rPr>
+          <w:rFonts w:ascii="Consolas" w:cs="Consolas" w:eastAsia="Consolas" w:hAnsi="Consolas"/>
+          <w:sz w:val="22"/>
+          <w:szCs w:val="22"/>
+        </w:rPr>
+        <w:t xml:space="preserve">adjustText</w:t>
+      </w:r>
+      <w:r>
+        <w:t xml:space="preserve"> (label placement on volcano plot).</w:t>
       </w:r>
     </w:p>
     <w:p>
@@ -765,10 +894,10 @@
           <w:sz w:val="22"/>
           <w:szCs w:val="22"/>
         </w:rPr>
-        <w:t xml:space="preserve">Ambiguity Level &lt;= 2B</w:t>
-      </w:r>
-      <w:r>
-        <w:t xml:space="preserve">. Reduces 430,665 → 79,201 rows.</w:t>
+        <w:t xml:space="preserve">Ambiguity Level == "1"</w:t>
+      </w:r>
+      <w:r>
+        <w:t xml:space="preserve"> (strictest tier, exact peptide-to-protein assignment). Reduces 430,665 → 79,137 rows.</w:t>
       </w:r>
     </w:p>
     <w:p>
@@ -819,7 +948,17 @@
         <w:t xml:space="preserve">0</w:t>
       </w:r>
       <w:r>
-        <w:t xml:space="preserve"> in any of the 18 TMT channels. 79,201 → 75,440 rows.</w:t>
+        <w:t xml:space="preserve"> in any of the 18 TMT channels. 79,137 → </w:t>
+      </w:r>
+      <w:r>
+        <w:rPr>
+          <w:b/>
+          <w:bCs/>
+        </w:rPr>
+        <w:t xml:space="preserve">75,379 rows</w:t>
+      </w:r>
+      <w:r>
+        <w:t xml:space="preserve">.</w:t>
       </w:r>
     </w:p>
     <w:p>
@@ -883,7 +1022,29 @@
         <w:t xml:space="preserve">Common Fixed</w:t>
       </w:r>
       <w:r>
-        <w:t xml:space="preserve"> — these are not real PTMs.</w:t>
+        <w:t xml:space="preserve">, </w:t>
+      </w:r>
+      <w:r>
+        <w:rPr>
+          <w:rFonts w:ascii="Consolas" w:cs="Consolas" w:eastAsia="Consolas" w:hAnsi="Consolas"/>
+          <w:sz w:val="22"/>
+          <w:szCs w:val="22"/>
+        </w:rPr>
+        <w:t xml:space="preserve">Metal</w:t>
+      </w:r>
+      <w:r>
+        <w:t xml:space="preserve">, </w:t>
+      </w:r>
+      <w:r>
+        <w:rPr>
+          <w:rFonts w:ascii="Consolas" w:cs="Consolas" w:eastAsia="Consolas" w:hAnsi="Consolas"/>
+          <w:sz w:val="22"/>
+          <w:szCs w:val="22"/>
+        </w:rPr>
+        <w:t xml:space="preserve">Artifact</w:t>
+      </w:r>
+      <w:r>
+        <w:t xml:space="preserve"> — these are not real biological PTMs.</w:t>
       </w:r>
     </w:p>
     <w:p>
@@ -956,7 +1117,7 @@
         <w:t xml:space="preserve">Full Sequence</w:t>
       </w:r>
       <w:r>
-        <w:t xml:space="preserve"> contains '|' — 65 and 61 rows respectively. The dropped rows account for &lt;0.1% of total intensity per channel.</w:t>
+        <w:t xml:space="preserve"> contain '|' — 65 rows in span ambiguity (sequence ambiguity is now 0 because of the stricter Ambiguity Level filter). The dropped rows account for &lt;0.05% of total intensity per channel.</w:t>
       </w:r>
     </w:p>
     <w:p>
@@ -1303,7 +1464,7 @@
         <w:t xml:space="preserve">SiteModification</w:t>
       </w:r>
       <w:r>
-        <w:t xml:space="preserve"> object stores per-channel </w:t>
+        <w:t xml:space="preserve"> stores per-channel </w:t>
       </w:r>
       <w:r>
         <w:rPr>
@@ -1314,7 +1475,7 @@
         <w:t xml:space="preserve">mod_intensity</w:t>
       </w:r>
       <w:r>
-        <w:t xml:space="preserve">, the inherited </w:t>
+        <w:t xml:space="preserve">, inherited </w:t>
       </w:r>
       <w:r>
         <w:rPr>
@@ -1325,7 +1486,18 @@
         <w:t xml:space="preserve">total_intensity</w:t>
       </w:r>
       <w:r>
-        <w:t xml:space="preserve">, and metadata (</w:t>
+        <w:t xml:space="preserve">, a PSM count (</w:t>
+      </w:r>
+      <w:r>
+        <w:rPr>
+          <w:rFonts w:ascii="Consolas" w:cs="Consolas" w:eastAsia="Consolas" w:hAnsi="Consolas"/>
+          <w:sz w:val="22"/>
+          <w:szCs w:val="22"/>
+        </w:rPr>
+        <w:t xml:space="preserve">number_of_psms</w:t>
+      </w:r>
+      <w:r>
+        <w:t xml:space="preserve">), and metadata (</w:t>
       </w:r>
       <w:r>
         <w:rPr>
@@ -1376,7 +1548,7 @@
           <w:b/>
           <w:bCs/>
         </w:rPr>
-        <w:t xml:space="preserve">797 unique site-modifications</w:t>
+        <w:t xml:space="preserve">660 unique site-modifications</w:t>
       </w:r>
       <w:r>
         <w:t xml:space="preserve">.</w:t>
@@ -1393,20 +1565,27 @@
           <w:bCs/>
           <w:color w:val="1A365D"/>
         </w:rPr>
-        <w:t xml:space="preserve">5. Occupancy Calculation</w:t>
-      </w:r>
-    </w:p>
-    <w:p>
-      <w:pPr>
-        <w:pStyle w:val="ListParagraph"/>
-        <w:numPr>
-          <w:ilvl w:val="0"/>
-          <w:numId w:val="2"/>
-        </w:numPr>
-        <w:spacing w:after="80" w:line="280"/>
-      </w:pPr>
-      <w:r>
-        <w:t xml:space="preserve">For each </w:t>
+        <w:t xml:space="preserve">5. Occupancy &amp; Derived Metrics</w:t>
+      </w:r>
+    </w:p>
+    <w:p>
+      <w:pPr>
+        <w:pStyle w:val="ListParagraph"/>
+        <w:numPr>
+          <w:ilvl w:val="0"/>
+          <w:numId w:val="2"/>
+        </w:numPr>
+        <w:spacing w:after="80" w:line="280"/>
+      </w:pPr>
+      <w:r>
+        <w:rPr>
+          <w:b/>
+          <w:bCs/>
+        </w:rPr>
+        <w:t xml:space="preserve">Occupancy: </w:t>
+      </w:r>
+      <w:r>
+        <w:t xml:space="preserve">for each </w:t>
       </w:r>
       <w:r>
         <w:rPr>
@@ -1427,7 +1606,7 @@
         <w:t xml:space="preserve">occupancy = mod_intensity / total_intensity</w:t>
       </w:r>
       <w:r>
-        <w:t xml:space="preserve">, computed independently per TMT channel.</w:t>
+        <w:t xml:space="preserve">, per-channel.</w:t>
       </w:r>
     </w:p>
     <w:p>
@@ -1464,7 +1643,81 @@
         <w:spacing w:after="80" w:line="280"/>
       </w:pPr>
       <w:r>
-        <w:t xml:space="preserve">Diagnostic heatmaps visualize the occupancy matrix two ways: alternating undrugged/drugged channels, and undrugged channels followed by drugged channels for direct visual comparison.</w:t>
+        <w:rPr>
+          <w:b/>
+          <w:bCs/>
+        </w:rPr>
+        <w:t xml:space="preserve">Mean sample intensity-weighted site abundance: </w:t>
+      </w:r>
+      <w:r>
+        <w:rPr>
+          <w:rFonts w:ascii="Consolas" w:cs="Consolas" w:eastAsia="Consolas" w:hAnsi="Consolas"/>
+          <w:sz w:val="22"/>
+          <w:szCs w:val="22"/>
+        </w:rPr>
+        <w:t xml:space="preserve">occupancy × mean(total_intensity across sites)</w:t>
+      </w:r>
+      <w:r>
+        <w:t xml:space="preserve">. This puts each site on a comparable absolute scale, mitigating the scale-compression of pure ratios for use in downstream log/limma analysis.</w:t>
+      </w:r>
+    </w:p>
+    <w:p>
+      <w:pPr>
+        <w:pStyle w:val="ListParagraph"/>
+        <w:numPr>
+          <w:ilvl w:val="0"/>
+          <w:numId w:val="2"/>
+        </w:numPr>
+        <w:spacing w:after="80" w:line="280"/>
+      </w:pPr>
+      <w:r>
+        <w:rPr>
+          <w:b/>
+          <w:bCs/>
+        </w:rPr>
+        <w:t xml:space="preserve">Logit / inv-logit utilities: </w:t>
+      </w:r>
+      <w:r>
+        <w:rPr>
+          <w:rFonts w:ascii="Consolas" w:cs="Consolas" w:eastAsia="Consolas" w:hAnsi="Consolas"/>
+          <w:sz w:val="22"/>
+          <w:szCs w:val="22"/>
+        </w:rPr>
+        <w:t xml:space="preserve">logit(p, eps=1e-3)</w:t>
+      </w:r>
+      <w:r>
+        <w:t xml:space="preserve"> and </w:t>
+      </w:r>
+      <w:r>
+        <w:rPr>
+          <w:rFonts w:ascii="Consolas" w:cs="Consolas" w:eastAsia="Consolas" w:hAnsi="Consolas"/>
+          <w:sz w:val="22"/>
+          <w:szCs w:val="22"/>
+        </w:rPr>
+        <w:t xml:space="preserve">inv_logit</w:t>
+      </w:r>
+      <w:r>
+        <w:t xml:space="preserve"> (with epsilon clipping) for transforming bounded occupancy values toward unbounded space.</w:t>
+      </w:r>
+    </w:p>
+    <w:p>
+      <w:pPr>
+        <w:pStyle w:val="ListParagraph"/>
+        <w:numPr>
+          <w:ilvl w:val="0"/>
+          <w:numId w:val="2"/>
+        </w:numPr>
+        <w:spacing w:after="80" w:line="280"/>
+      </w:pPr>
+      <w:r>
+        <w:rPr>
+          <w:b/>
+          <w:bCs/>
+        </w:rPr>
+        <w:t xml:space="preserve">Diagnostic distributions: </w:t>
+      </w:r>
+      <w:r>
+        <w:t xml:space="preserve">histograms of raw, log₂-transformed, logit-transformed, and log₂(mean-weighted) occupancies are plotted to choose a transform whose distribution is closest to normal for limma input.</w:t>
       </w:r>
     </w:p>
     <w:p>
@@ -1495,17 +1748,17 @@
         <w:t xml:space="preserve">0 &lt; sum(occupancy) &lt; 18</w:t>
       </w:r>
       <w:r>
-        <w:t xml:space="preserve"> are retained — i.e. drop sites that are completely zero or saturated (sum equals the channel count). 797 site-modifications → </w:t>
-      </w:r>
-      <w:r>
-        <w:rPr>
-          <w:b/>
-          <w:bCs/>
-        </w:rPr>
-        <w:t xml:space="preserve">515 final rows</w:t>
-      </w:r>
-      <w:r>
-        <w:t xml:space="preserve">.</w:t>
+        <w:t xml:space="preserve"> are retained — drops uniformly-zero or saturated sites. 660 → </w:t>
+      </w:r>
+      <w:r>
+        <w:rPr>
+          <w:b/>
+          <w:bCs/>
+        </w:rPr>
+        <w:t xml:space="preserve">379 sites</w:t>
+      </w:r>
+      <w:r>
+        <w:t xml:space="preserve"> go forward.</w:t>
       </w:r>
     </w:p>
     <w:p>
@@ -1575,7 +1828,10 @@
           <w:b/>
           <w:bCs/>
         </w:rPr>
-        <w:t xml:space="preserve">Schema (22 columns): </w:t>
+        <w:t xml:space="preserve">Schema (76 columns): </w:t>
+      </w:r>
+      <w:r>
+        <w:t xml:space="preserve">4 metadata columns (</w:t>
       </w:r>
       <w:r>
         <w:rPr>
@@ -1619,40 +1875,91 @@
         <w:t xml:space="preserve">Gene Name</w:t>
       </w:r>
       <w:r>
-        <w:t xml:space="preserve">, followed by 18 columns of per-channel occupancy (</w:t>
-      </w:r>
-      <w:r>
-        <w:rPr>
-          <w:rFonts w:ascii="Consolas" w:cs="Consolas" w:eastAsia="Consolas" w:hAnsi="Consolas"/>
-          <w:sz w:val="22"/>
-          <w:szCs w:val="22"/>
-        </w:rPr>
-        <w:t xml:space="preserve">126</w:t>
-      </w:r>
-      <w:r>
-        <w:t xml:space="preserve">, </w:t>
-      </w:r>
-      <w:r>
-        <w:rPr>
-          <w:rFonts w:ascii="Consolas" w:cs="Consolas" w:eastAsia="Consolas" w:hAnsi="Consolas"/>
-          <w:sz w:val="22"/>
-          <w:szCs w:val="22"/>
-        </w:rPr>
-        <w:t xml:space="preserve">127N</w:t>
-      </w:r>
-      <w:r>
-        <w:t xml:space="preserve">, …, </w:t>
-      </w:r>
-      <w:r>
-        <w:rPr>
-          <w:rFonts w:ascii="Consolas" w:cs="Consolas" w:eastAsia="Consolas" w:hAnsi="Consolas"/>
-          <w:sz w:val="22"/>
-          <w:szCs w:val="22"/>
-        </w:rPr>
-        <w:t xml:space="preserve">135N</w:t>
-      </w:r>
-      <w:r>
-        <w:t xml:space="preserve">).</w:t>
+        <w:t xml:space="preserve">) + four 18-channel groups, in this order:</w:t>
+      </w:r>
+    </w:p>
+    <w:p>
+      <w:pPr>
+        <w:pStyle w:val="ListParagraph"/>
+        <w:numPr>
+          <w:ilvl w:val="0"/>
+          <w:numId w:val="2"/>
+        </w:numPr>
+        <w:spacing w:after="80" w:line="280"/>
+      </w:pPr>
+      <w:r>
+        <w:rPr>
+          <w:rFonts w:ascii="Consolas" w:cs="Consolas" w:eastAsia="Consolas" w:hAnsi="Consolas"/>
+          <w:sz w:val="22"/>
+          <w:szCs w:val="22"/>
+        </w:rPr>
+        <w:t xml:space="preserve">&lt;channel&gt; Mod Intensity</w:t>
+      </w:r>
+      <w:r>
+        <w:t xml:space="preserve"> (raw numerator, summed TMT for modified PSMs)</w:t>
+      </w:r>
+    </w:p>
+    <w:p>
+      <w:pPr>
+        <w:pStyle w:val="ListParagraph"/>
+        <w:numPr>
+          <w:ilvl w:val="0"/>
+          <w:numId w:val="2"/>
+        </w:numPr>
+        <w:spacing w:after="80" w:line="280"/>
+      </w:pPr>
+      <w:r>
+        <w:rPr>
+          <w:rFonts w:ascii="Consolas" w:cs="Consolas" w:eastAsia="Consolas" w:hAnsi="Consolas"/>
+          <w:sz w:val="22"/>
+          <w:szCs w:val="22"/>
+        </w:rPr>
+        <w:t xml:space="preserve">&lt;channel&gt; Total Intensity</w:t>
+      </w:r>
+      <w:r>
+        <w:t xml:space="preserve"> (raw denominator, summed TMT across all peptides covering the site)</w:t>
+      </w:r>
+    </w:p>
+    <w:p>
+      <w:pPr>
+        <w:pStyle w:val="ListParagraph"/>
+        <w:numPr>
+          <w:ilvl w:val="0"/>
+          <w:numId w:val="2"/>
+        </w:numPr>
+        <w:spacing w:after="80" w:line="280"/>
+      </w:pPr>
+      <w:r>
+        <w:rPr>
+          <w:rFonts w:ascii="Consolas" w:cs="Consolas" w:eastAsia="Consolas" w:hAnsi="Consolas"/>
+          <w:sz w:val="22"/>
+          <w:szCs w:val="22"/>
+        </w:rPr>
+        <w:t xml:space="preserve">&lt;channel&gt; Mean Sample Intensity-Weighted Site Abundance</w:t>
+      </w:r>
+      <w:r>
+        <w:t xml:space="preserve"> (occupancy × mean total intensity)</w:t>
+      </w:r>
+    </w:p>
+    <w:p>
+      <w:pPr>
+        <w:pStyle w:val="ListParagraph"/>
+        <w:numPr>
+          <w:ilvl w:val="0"/>
+          <w:numId w:val="2"/>
+        </w:numPr>
+        <w:spacing w:after="80" w:line="280"/>
+      </w:pPr>
+      <w:r>
+        <w:rPr>
+          <w:rFonts w:ascii="Consolas" w:cs="Consolas" w:eastAsia="Consolas" w:hAnsi="Consolas"/>
+          <w:sz w:val="22"/>
+          <w:szCs w:val="22"/>
+        </w:rPr>
+        <w:t xml:space="preserve">&lt;channel&gt; Occupancy</w:t>
+      </w:r>
+      <w:r>
+        <w:t xml:space="preserve"> (modified / total per channel; the original target metric)</w:t>
       </w:r>
     </w:p>
     <w:p>
@@ -1676,41 +1983,41 @@
           <w:b/>
           <w:bCs/>
         </w:rPr>
-        <w:t xml:space="preserve">515</w:t>
-      </w:r>
-      <w:r>
-        <w:t xml:space="preserve"> site-modifications (after the </w:t>
-      </w:r>
-      <w:r>
-        <w:rPr>
-          <w:rFonts w:ascii="Consolas" w:cs="Consolas" w:eastAsia="Consolas" w:hAnsi="Consolas"/>
-          <w:sz w:val="22"/>
-          <w:szCs w:val="22"/>
-        </w:rPr>
-        <w:t xml:space="preserve">0 &lt; sum &lt; 18</w:t>
-      </w:r>
-      <w:r>
-        <w:t xml:space="preserve"> filter), sorted by Accession → Position → Modification.</w:t>
-      </w:r>
-    </w:p>
-    <w:p>
-      <w:pPr>
-        <w:pStyle w:val="ListParagraph"/>
-        <w:numPr>
-          <w:ilvl w:val="0"/>
-          <w:numId w:val="2"/>
-        </w:numPr>
-        <w:spacing w:after="80" w:line="280"/>
-      </w:pPr>
-      <w:r>
-        <w:rPr>
-          <w:b/>
-          <w:bCs/>
-        </w:rPr>
-        <w:t xml:space="preserve">PTM types observed (27): </w:t>
-      </w:r>
-      <w:r>
-        <w:t xml:space="preserve">3-/4-hydroxyproline, multiple acetyl- and methyl-lysines, phospho-S/T/Y, deamidation, dimethyl- and trimethyl-arginines, sulfonic-acid / persulfide cysteine, sodium adducts, etc.</w:t>
+        <w:t xml:space="preserve">379</w:t>
+      </w:r>
+      <w:r>
+        <w:t xml:space="preserve"> site-modifications, sorted by Accession → Position → Modification.</w:t>
+      </w:r>
+    </w:p>
+    <w:p>
+      <w:pPr>
+        <w:pStyle w:val="ListParagraph"/>
+        <w:numPr>
+          <w:ilvl w:val="0"/>
+          <w:numId w:val="2"/>
+        </w:numPr>
+        <w:spacing w:after="80" w:line="280"/>
+      </w:pPr>
+      <w:r>
+        <w:rPr>
+          <w:b/>
+          <w:bCs/>
+        </w:rPr>
+        <w:t xml:space="preserve">PTM types observed (25): </w:t>
+      </w:r>
+      <w:r>
+        <w:t xml:space="preserve">3-/4-hydroxyproline, multiple acetyl- and methyl-lysines, phospho-S/T/Y, deamidation, dimethyl- and trimethyl-arginines, sulfonic-acid / persulfide cysteine. Sodium adducts are no longer present because </w:t>
+      </w:r>
+      <w:r>
+        <w:rPr>
+          <w:rFonts w:ascii="Consolas" w:cs="Consolas" w:eastAsia="Consolas" w:hAnsi="Consolas"/>
+          <w:sz w:val="22"/>
+          <w:szCs w:val="22"/>
+        </w:rPr>
+        <w:t xml:space="preserve">Metal</w:t>
+      </w:r>
+      <w:r>
+        <w:t xml:space="preserve"> is in the insignificant-mods list.</w:t>
       </w:r>
     </w:p>
     <w:p>
@@ -1724,20 +2031,301 @@
           <w:bCs/>
           <w:color w:val="1A365D"/>
         </w:rPr>
-        <w:t xml:space="preserve">7. Assumptions &amp; Limitations</w:t>
-      </w:r>
-    </w:p>
-    <w:p>
-      <w:pPr>
-        <w:pStyle w:val="ListParagraph"/>
-        <w:numPr>
-          <w:ilvl w:val="0"/>
-          <w:numId w:val="2"/>
-        </w:numPr>
-        <w:spacing w:after="80" w:line="280"/>
-      </w:pPr>
-      <w:r>
-        <w:t xml:space="preserve">Channel layout: undrugged/drugged alternation starts at 126 and continues through 135N.</w:t>
+        <w:t xml:space="preserve">7. Differential Occupancy Analysis</w:t>
+      </w:r>
+    </w:p>
+    <w:p>
+      <w:pPr>
+        <w:pStyle w:val="ListParagraph"/>
+        <w:numPr>
+          <w:ilvl w:val="0"/>
+          <w:numId w:val="2"/>
+        </w:numPr>
+        <w:spacing w:after="80" w:line="280"/>
+      </w:pPr>
+      <w:r>
+        <w:rPr>
+          <w:b/>
+          <w:bCs/>
+        </w:rPr>
+        <w:t xml:space="preserve">Input matrix: </w:t>
+      </w:r>
+      <w:r>
+        <w:rPr>
+          <w:rFonts w:ascii="Consolas" w:cs="Consolas" w:eastAsia="Consolas" w:hAnsi="Consolas"/>
+          <w:sz w:val="22"/>
+          <w:szCs w:val="22"/>
+        </w:rPr>
+        <w:t xml:space="preserve">log₂(Mean Sample Intensity-Weighted Site Abundance)</w:t>
+      </w:r>
+      <w:r>
+        <w:t xml:space="preserve"> — chosen because its histogram across the 18 channels is closest to normal among the four candidate transforms.</w:t>
+      </w:r>
+    </w:p>
+    <w:p>
+      <w:pPr>
+        <w:pStyle w:val="ListParagraph"/>
+        <w:numPr>
+          <w:ilvl w:val="0"/>
+          <w:numId w:val="2"/>
+        </w:numPr>
+        <w:spacing w:after="80" w:line="280"/>
+      </w:pPr>
+      <w:r>
+        <w:rPr>
+          <w:b/>
+          <w:bCs/>
+        </w:rPr>
+        <w:t xml:space="preserve">Experimental design: </w:t>
+      </w:r>
+      <w:r>
+        <w:t xml:space="preserve">paired, within-mouse comparison. The design matrix has an intercept, a </w:t>
+      </w:r>
+      <w:r>
+        <w:rPr>
+          <w:rFonts w:ascii="Consolas" w:cs="Consolas" w:eastAsia="Consolas" w:hAnsi="Consolas"/>
+          <w:sz w:val="22"/>
+          <w:szCs w:val="22"/>
+        </w:rPr>
+        <w:t xml:space="preserve">drugged</w:t>
+      </w:r>
+      <w:r>
+        <w:t xml:space="preserve"> indicator that alternates 0,1 across channels, and 8 mouse-pair dummies (one per mouse, drop-first encoding) to absorb between-mouse variance as fixed effects.</w:t>
+      </w:r>
+    </w:p>
+    <w:p>
+      <w:pPr>
+        <w:pStyle w:val="ListParagraph"/>
+        <w:numPr>
+          <w:ilvl w:val="0"/>
+          <w:numId w:val="2"/>
+        </w:numPr>
+        <w:spacing w:after="80" w:line="280"/>
+      </w:pPr>
+      <w:r>
+        <w:rPr>
+          <w:b/>
+          <w:bCs/>
+        </w:rPr>
+        <w:t xml:space="preserve">Model: </w:t>
+      </w:r>
+      <w:r>
+        <w:rPr>
+          <w:rFonts w:ascii="Consolas" w:cs="Consolas" w:eastAsia="Consolas" w:hAnsi="Consolas"/>
+          <w:sz w:val="22"/>
+          <w:szCs w:val="22"/>
+        </w:rPr>
+        <w:t xml:space="preserve">limma_py.lmFit(matrix, design)</w:t>
+      </w:r>
+      <w:r>
+        <w:t xml:space="preserve"> → </w:t>
+      </w:r>
+      <w:r>
+        <w:rPr>
+          <w:rFonts w:ascii="Consolas" w:cs="Consolas" w:eastAsia="Consolas" w:hAnsi="Consolas"/>
+          <w:sz w:val="22"/>
+          <w:szCs w:val="22"/>
+        </w:rPr>
+        <w:t xml:space="preserve">eBayes</w:t>
+      </w:r>
+      <w:r>
+        <w:t xml:space="preserve"> → </w:t>
+      </w:r>
+      <w:r>
+        <w:rPr>
+          <w:rFonts w:ascii="Consolas" w:cs="Consolas" w:eastAsia="Consolas" w:hAnsi="Consolas"/>
+          <w:sz w:val="22"/>
+          <w:szCs w:val="22"/>
+        </w:rPr>
+        <w:t xml:space="preserve">toptable(coef='drugged', adjust='BH')</w:t>
+      </w:r>
+      <w:r>
+        <w:t xml:space="preserve">. Returns </w:t>
+      </w:r>
+      <w:r>
+        <w:rPr>
+          <w:rFonts w:ascii="Consolas" w:cs="Consolas" w:eastAsia="Consolas" w:hAnsi="Consolas"/>
+          <w:sz w:val="22"/>
+          <w:szCs w:val="22"/>
+        </w:rPr>
+        <w:t xml:space="preserve">logFC</w:t>
+      </w:r>
+      <w:r>
+        <w:t xml:space="preserve">, </w:t>
+      </w:r>
+      <w:r>
+        <w:rPr>
+          <w:rFonts w:ascii="Consolas" w:cs="Consolas" w:eastAsia="Consolas" w:hAnsi="Consolas"/>
+          <w:sz w:val="22"/>
+          <w:szCs w:val="22"/>
+        </w:rPr>
+        <w:t xml:space="preserve">AvgOcc</w:t>
+      </w:r>
+      <w:r>
+        <w:t xml:space="preserve">, </w:t>
+      </w:r>
+      <w:r>
+        <w:rPr>
+          <w:rFonts w:ascii="Consolas" w:cs="Consolas" w:eastAsia="Consolas" w:hAnsi="Consolas"/>
+          <w:sz w:val="22"/>
+          <w:szCs w:val="22"/>
+        </w:rPr>
+        <w:t xml:space="preserve">t</w:t>
+      </w:r>
+      <w:r>
+        <w:t xml:space="preserve">, </w:t>
+      </w:r>
+      <w:r>
+        <w:rPr>
+          <w:rFonts w:ascii="Consolas" w:cs="Consolas" w:eastAsia="Consolas" w:hAnsi="Consolas"/>
+          <w:sz w:val="22"/>
+          <w:szCs w:val="22"/>
+        </w:rPr>
+        <w:t xml:space="preserve">P.Value</w:t>
+      </w:r>
+      <w:r>
+        <w:t xml:space="preserve">, </w:t>
+      </w:r>
+      <w:r>
+        <w:rPr>
+          <w:rFonts w:ascii="Consolas" w:cs="Consolas" w:eastAsia="Consolas" w:hAnsi="Consolas"/>
+          <w:sz w:val="22"/>
+          <w:szCs w:val="22"/>
+        </w:rPr>
+        <w:t xml:space="preserve">adj.P.Val</w:t>
+      </w:r>
+      <w:r>
+        <w:t xml:space="preserve">, </w:t>
+      </w:r>
+      <w:r>
+        <w:rPr>
+          <w:rFonts w:ascii="Consolas" w:cs="Consolas" w:eastAsia="Consolas" w:hAnsi="Consolas"/>
+          <w:sz w:val="22"/>
+          <w:szCs w:val="22"/>
+        </w:rPr>
+        <w:t xml:space="preserve">B</w:t>
+      </w:r>
+      <w:r>
+        <w:t xml:space="preserve"> for each of the 379 sites.</w:t>
+      </w:r>
+    </w:p>
+    <w:p>
+      <w:pPr>
+        <w:pStyle w:val="ListParagraph"/>
+        <w:numPr>
+          <w:ilvl w:val="0"/>
+          <w:numId w:val="2"/>
+        </w:numPr>
+        <w:spacing w:after="80" w:line="280"/>
+      </w:pPr>
+      <w:r>
+        <w:rPr>
+          <w:b/>
+          <w:bCs/>
+        </w:rPr>
+        <w:t xml:space="preserve">Volcano plot: </w:t>
+      </w:r>
+      <w:r>
+        <w:rPr>
+          <w:rFonts w:ascii="Consolas" w:cs="Consolas" w:eastAsia="Consolas" w:hAnsi="Consolas"/>
+          <w:sz w:val="22"/>
+          <w:szCs w:val="22"/>
+        </w:rPr>
+        <w:t xml:space="preserve">logFC</w:t>
+      </w:r>
+      <w:r>
+        <w:t xml:space="preserve"> vs </w:t>
+      </w:r>
+      <w:r>
+        <w:rPr>
+          <w:rFonts w:ascii="Consolas" w:cs="Consolas" w:eastAsia="Consolas" w:hAnsi="Consolas"/>
+          <w:sz w:val="22"/>
+          <w:szCs w:val="22"/>
+        </w:rPr>
+        <w:t xml:space="preserve">-log₁₀(adj.P.Val)</w:t>
+      </w:r>
+      <w:r>
+        <w:t xml:space="preserve">, marker size = mean per-site occupancy (×100), red dashed line at adj.P.Val = 0.05. Top hits are auto-labelled (gene name) when </w:t>
+      </w:r>
+      <w:r>
+        <w:rPr>
+          <w:rFonts w:ascii="Consolas" w:cs="Consolas" w:eastAsia="Consolas" w:hAnsi="Consolas"/>
+          <w:sz w:val="22"/>
+          <w:szCs w:val="22"/>
+        </w:rPr>
+        <w:t xml:space="preserve">adj.P.Val ≤ 0.005</w:t>
+      </w:r>
+      <w:r>
+        <w:t xml:space="preserve">, </w:t>
+      </w:r>
+      <w:r>
+        <w:rPr>
+          <w:rFonts w:ascii="Consolas" w:cs="Consolas" w:eastAsia="Consolas" w:hAnsi="Consolas"/>
+          <w:sz w:val="22"/>
+          <w:szCs w:val="22"/>
+        </w:rPr>
+        <w:t xml:space="preserve">|logFC| ≥ 0.03</w:t>
+      </w:r>
+      <w:r>
+        <w:t xml:space="preserve">, and mean occupancy &gt; 0.015; </w:t>
+      </w:r>
+      <w:r>
+        <w:rPr>
+          <w:rFonts w:ascii="Consolas" w:cs="Consolas" w:eastAsia="Consolas" w:hAnsi="Consolas"/>
+          <w:sz w:val="22"/>
+          <w:szCs w:val="22"/>
+        </w:rPr>
+        <w:t xml:space="preserve">adjustText</w:t>
+      </w:r>
+      <w:r>
+        <w:t xml:space="preserve"> prevents label overlap.</w:t>
+      </w:r>
+    </w:p>
+    <w:p>
+      <w:pPr>
+        <w:pStyle w:val="ListParagraph"/>
+        <w:numPr>
+          <w:ilvl w:val="0"/>
+          <w:numId w:val="2"/>
+        </w:numPr>
+        <w:spacing w:after="80" w:line="280"/>
+      </w:pPr>
+      <w:r>
+        <w:rPr>
+          <w:b/>
+          <w:bCs/>
+        </w:rPr>
+        <w:t xml:space="preserve">Top up-regulated hits </w:t>
+      </w:r>
+      <w:r>
+        <w:t xml:space="preserve">(logFC ≥ 0.03, adj.P.Val ≤ 0.005): H1-4 S36, Sqstm1 S24, Ctnnd1 S864, Pebp1 P11 (hydroxylation), Sgt S307, Hid1 S593, Slk S647, Syap1 S283, Srp14 S45.</w:t>
+      </w:r>
+    </w:p>
+    <w:p>
+      <w:pPr>
+        <w:pStyle w:val="Heading2"/>
+        <w:spacing w:after="120" w:before="240"/>
+      </w:pPr>
+      <w:r>
+        <w:rPr>
+          <w:b/>
+          <w:bCs/>
+          <w:color w:val="1A365D"/>
+        </w:rPr>
+        <w:t xml:space="preserve">8. Assumptions &amp; Limitations</w:t>
+      </w:r>
+    </w:p>
+    <w:p>
+      <w:pPr>
+        <w:pStyle w:val="ListParagraph"/>
+        <w:numPr>
+          <w:ilvl w:val="0"/>
+          <w:numId w:val="2"/>
+        </w:numPr>
+        <w:spacing w:after="80" w:line="280"/>
+      </w:pPr>
+      <w:r>
+        <w:t xml:space="preserve">Channel layout: undrugged/drugged alternation starts at 126 and continues through 135N. Pair order in the design matrix is the order channels appear in the file.</w:t>
       </w:r>
     </w:p>
     <w:p>
@@ -1763,7 +2351,7 @@
         <w:spacing w:after="80" w:line="280"/>
       </w:pPr>
       <w:r>
-        <w:t xml:space="preserve">Residue-span and full-sequence ambiguity (</w:t>
+        <w:t xml:space="preserve">Residue-span ambiguity (</w:t>
       </w:r>
       <w:r>
         <w:rPr>
@@ -1774,7 +2362,7 @@
         <w:t xml:space="preserve">|</w:t>
       </w:r>
       <w:r>
-        <w:t xml:space="preserve">-containing) rows are discarded rather than resolved probabilistically. Protein-group accession ambiguity is </w:t>
+        <w:t xml:space="preserve">-containing) rows are discarded. Protein-group accession ambiguity is </w:t>
       </w:r>
       <w:r>
         <w:rPr>
@@ -1820,20 +2408,20 @@
         <w:spacing w:after="80" w:line="280"/>
       </w:pPr>
       <w:r>
-        <w:t xml:space="preserve">N-terminal modifications are credited to the protein only when the peptide starts at position 1 of the protein.</w:t>
-      </w:r>
-    </w:p>
-    <w:p>
-      <w:pPr>
-        <w:pStyle w:val="ListParagraph"/>
-        <w:numPr>
-          <w:ilvl w:val="0"/>
-          <w:numId w:val="2"/>
-        </w:numPr>
-        <w:spacing w:after="80" w:line="280"/>
-      </w:pPr>
-      <w:r>
-        <w:t xml:space="preserve">Occupancy is a simple intensity ratio; no correction for ionization efficiency, no statistical test, and no replicate-aware variance modelling is applied.</w:t>
+        <w:t xml:space="preserve">N-terminal modifications are credited only when the peptide starts at position 1 of the protein.</w:t>
+      </w:r>
+    </w:p>
+    <w:p>
+      <w:pPr>
+        <w:pStyle w:val="ListParagraph"/>
+        <w:numPr>
+          <w:ilvl w:val="0"/>
+          <w:numId w:val="2"/>
+        </w:numPr>
+        <w:spacing w:after="80" w:line="280"/>
+      </w:pPr>
+      <w:r>
+        <w:t xml:space="preserve">Occupancy is a simple intensity ratio; no correction for ionization efficiency is applied. The mean-weighted variant partially compensates by re-scaling sites onto a common intensity range but is not a rigorous IE correction.</w:t>
       </w:r>
     </w:p>
     <w:p>
@@ -1864,7 +2452,79 @@
         <w:t xml:space="preserve">0 &lt; sum(occupancy) &lt; 18</w:t>
       </w:r>
       <w:r>
-        <w:t xml:space="preserve"> condition removes sites that are uniformly zero or uniformly saturated across the 18 channels. This is a coarse filter; sites with very low but non-zero occupancy across all channels still pass through.</w:t>
+        <w:t xml:space="preserve"> condition removes sites that are uniformly zero or uniformly saturated. Sites with very low but non-zero occupancy across all channels still pass through.</w:t>
+      </w:r>
+    </w:p>
+    <w:p>
+      <w:pPr>
+        <w:pStyle w:val="ListParagraph"/>
+        <w:numPr>
+          <w:ilvl w:val="0"/>
+          <w:numId w:val="2"/>
+        </w:numPr>
+        <w:spacing w:after="80" w:line="280"/>
+      </w:pPr>
+      <w:r>
+        <w:rPr>
+          <w:b/>
+          <w:bCs/>
+        </w:rPr>
+        <w:t xml:space="preserve">Differential analysis: </w:t>
+      </w:r>
+      <w:r>
+        <w:t xml:space="preserve">limma assumes approximate normality of the transformed data; the histogram diagnostic is the only check. Mouse pairing is treated as a fixed effect rather than a random effect, which can over-fit when sites are sparse.</w:t>
+      </w:r>
+    </w:p>
+    <w:p>
+      <w:pPr>
+        <w:pStyle w:val="ListParagraph"/>
+        <w:numPr>
+          <w:ilvl w:val="0"/>
+          <w:numId w:val="2"/>
+        </w:numPr>
+        <w:spacing w:after="80" w:line="280"/>
+      </w:pPr>
+      <w:r>
+        <w:rPr>
+          <w:b/>
+          <w:bCs/>
+        </w:rPr>
+        <w:t xml:space="preserve">Effect-size threshold: </w:t>
+      </w:r>
+      <w:r>
+        <w:t xml:space="preserve">the </w:t>
+      </w:r>
+      <w:r>
+        <w:rPr>
+          <w:rFonts w:ascii="Consolas" w:cs="Consolas" w:eastAsia="Consolas" w:hAnsi="Consolas"/>
+          <w:sz w:val="22"/>
+          <w:szCs w:val="22"/>
+        </w:rPr>
+        <w:t xml:space="preserve">logFC ≥ 0.03</w:t>
+      </w:r>
+      <w:r>
+        <w:t xml:space="preserve"> cut-off for top hits corresponds to a ~2% change on the log₂ scale of mean-weighted abundance, </w:t>
+      </w:r>
+      <w:r>
+        <w:rPr>
+          <w:i/>
+          <w:iCs/>
+        </w:rPr>
+        <w:t xml:space="preserve">not</w:t>
+      </w:r>
+      <w:r>
+        <w:t xml:space="preserve"> a 2% change in occupancy itself; interpret </w:t>
+      </w:r>
+      <w:r>
+        <w:rPr>
+          <w:rFonts w:ascii="Consolas" w:cs="Consolas" w:eastAsia="Consolas" w:hAnsi="Consolas"/>
+          <w:sz w:val="22"/>
+          <w:szCs w:val="22"/>
+        </w:rPr>
+        <w:t xml:space="preserve">logFC</w:t>
+      </w:r>
+      <w:r>
+        <w:t xml:space="preserve"> magnitudes accordingly.</w:t>
       </w:r>
     </w:p>
     <w:p>

</xml_diff>